<commit_message>
Fix table row-splitting causing jumbled colors across page breaks
Grading-scale, role, and checklist tables could split a single row
across a page boundary, leaving an orphaned colored cell with no
label on the next page — this read as garbled/mismatched colors.
Add cantSplit to every generated table row so rows move to the next
page as a whole. Also simplify the two-column role table (توزيع
الأدوار) from a competing green/brown split header to one consistent
green header band.

Co-Authored-By: Claude Sonnet 5 <noreply@anthropic.com>
Claude-Session: https://claude.ai/code/session_012kMrYTTx4SL8nruhvYy76s
</commit_message>
<xml_diff>
--- a/docwork/build/review_report.docx
+++ b/docwork/build/review_report.docx
@@ -984,6 +984,9 @@
         <w:gridCol w:w="1757"/>
       </w:tblGrid>
       <w:tr>
+        <w:trPr>
+          <w:cantSplit/>
+        </w:trPr>
         <w:tc>
           <w:tcPr>
             <w:tcW w:type="dxa" w:w="2041"/>
@@ -1181,6 +1184,9 @@
         </w:tc>
       </w:tr>
       <w:tr>
+        <w:trPr>
+          <w:cantSplit/>
+        </w:trPr>
         <w:tc>
           <w:tcPr>
             <w:tcW w:type="dxa" w:w="2041"/>
@@ -1378,6 +1384,9 @@
         </w:tc>
       </w:tr>
       <w:tr>
+        <w:trPr>
+          <w:cantSplit/>
+        </w:trPr>
         <w:tc>
           <w:tcPr>
             <w:tcW w:type="dxa" w:w="2041"/>
@@ -1575,6 +1584,9 @@
         </w:tc>
       </w:tr>
       <w:tr>
+        <w:trPr>
+          <w:cantSplit/>
+        </w:trPr>
         <w:tc>
           <w:tcPr>
             <w:tcW w:type="dxa" w:w="2041"/>
@@ -1772,6 +1784,9 @@
         </w:tc>
       </w:tr>
       <w:tr>
+        <w:trPr>
+          <w:cantSplit/>
+        </w:trPr>
         <w:tc>
           <w:tcPr>
             <w:tcW w:type="dxa" w:w="2041"/>
@@ -1969,6 +1984,9 @@
         </w:tc>
       </w:tr>
       <w:tr>
+        <w:trPr>
+          <w:cantSplit/>
+        </w:trPr>
         <w:tc>
           <w:tcPr>
             <w:tcW w:type="dxa" w:w="2041"/>
@@ -2166,6 +2184,9 @@
         </w:tc>
       </w:tr>
       <w:tr>
+        <w:trPr>
+          <w:cantSplit/>
+        </w:trPr>
         <w:tc>
           <w:tcPr>
             <w:tcW w:type="dxa" w:w="2041"/>
@@ -2422,6 +2443,9 @@
         <w:gridCol w:w="1644"/>
       </w:tblGrid>
       <w:tr>
+        <w:trPr>
+          <w:cantSplit/>
+        </w:trPr>
         <w:tc>
           <w:tcPr>
             <w:tcW w:type="dxa" w:w="397"/>
@@ -2619,6 +2643,9 @@
         </w:tc>
       </w:tr>
       <w:tr>
+        <w:trPr>
+          <w:cantSplit/>
+        </w:trPr>
         <w:tc>
           <w:tcPr>
             <w:tcW w:type="dxa" w:w="397"/>
@@ -2816,6 +2843,9 @@
         </w:tc>
       </w:tr>
       <w:tr>
+        <w:trPr>
+          <w:cantSplit/>
+        </w:trPr>
         <w:tc>
           <w:tcPr>
             <w:tcW w:type="dxa" w:w="397"/>
@@ -3013,6 +3043,9 @@
         </w:tc>
       </w:tr>
       <w:tr>
+        <w:trPr>
+          <w:cantSplit/>
+        </w:trPr>
         <w:tc>
           <w:tcPr>
             <w:tcW w:type="dxa" w:w="397"/>
@@ -3210,6 +3243,9 @@
         </w:tc>
       </w:tr>
       <w:tr>
+        <w:trPr>
+          <w:cantSplit/>
+        </w:trPr>
         <w:tc>
           <w:tcPr>
             <w:tcW w:type="dxa" w:w="397"/>
@@ -3407,6 +3443,9 @@
         </w:tc>
       </w:tr>
       <w:tr>
+        <w:trPr>
+          <w:cantSplit/>
+        </w:trPr>
         <w:tc>
           <w:tcPr>
             <w:tcW w:type="dxa" w:w="397"/>
@@ -3604,6 +3643,9 @@
         </w:tc>
       </w:tr>
       <w:tr>
+        <w:trPr>
+          <w:cantSplit/>
+        </w:trPr>
         <w:tc>
           <w:tcPr>
             <w:tcW w:type="dxa" w:w="397"/>
@@ -3801,6 +3843,9 @@
         </w:tc>
       </w:tr>
       <w:tr>
+        <w:trPr>
+          <w:cantSplit/>
+        </w:trPr>
         <w:tc>
           <w:tcPr>
             <w:tcW w:type="dxa" w:w="397"/>
@@ -3998,6 +4043,9 @@
         </w:tc>
       </w:tr>
       <w:tr>
+        <w:trPr>
+          <w:cantSplit/>
+        </w:trPr>
         <w:tc>
           <w:tcPr>
             <w:tcW w:type="dxa" w:w="397"/>
@@ -4231,6 +4279,9 @@
         <w:gridCol w:w="7937"/>
       </w:tblGrid>
       <w:tr>
+        <w:trPr>
+          <w:cantSplit/>
+        </w:trPr>
         <w:tc>
           <w:tcPr>
             <w:tcW w:type="dxa" w:w="850"/>
@@ -4310,6 +4361,9 @@
         </w:tc>
       </w:tr>
       <w:tr>
+        <w:trPr>
+          <w:cantSplit/>
+        </w:trPr>
         <w:tc>
           <w:tcPr>
             <w:tcW w:type="dxa" w:w="850"/>
@@ -4389,6 +4443,9 @@
         </w:tc>
       </w:tr>
       <w:tr>
+        <w:trPr>
+          <w:cantSplit/>
+        </w:trPr>
         <w:tc>
           <w:tcPr>
             <w:tcW w:type="dxa" w:w="850"/>
@@ -4468,6 +4525,9 @@
         </w:tc>
       </w:tr>
       <w:tr>
+        <w:trPr>
+          <w:cantSplit/>
+        </w:trPr>
         <w:tc>
           <w:tcPr>
             <w:tcW w:type="dxa" w:w="850"/>
@@ -4547,6 +4607,9 @@
         </w:tc>
       </w:tr>
       <w:tr>
+        <w:trPr>
+          <w:cantSplit/>
+        </w:trPr>
         <w:tc>
           <w:tcPr>
             <w:tcW w:type="dxa" w:w="850"/>
@@ -4626,6 +4689,9 @@
         </w:tc>
       </w:tr>
       <w:tr>
+        <w:trPr>
+          <w:cantSplit/>
+        </w:trPr>
         <w:tc>
           <w:tcPr>
             <w:tcW w:type="dxa" w:w="850"/>
@@ -4705,6 +4771,9 @@
         </w:tc>
       </w:tr>
       <w:tr>
+        <w:trPr>
+          <w:cantSplit/>
+        </w:trPr>
         <w:tc>
           <w:tcPr>
             <w:tcW w:type="dxa" w:w="850"/>
@@ -4784,6 +4853,9 @@
         </w:tc>
       </w:tr>
       <w:tr>
+        <w:trPr>
+          <w:cantSplit/>
+        </w:trPr>
         <w:tc>
           <w:tcPr>
             <w:tcW w:type="dxa" w:w="850"/>
@@ -4863,6 +4935,9 @@
         </w:tc>
       </w:tr>
       <w:tr>
+        <w:trPr>
+          <w:cantSplit/>
+        </w:trPr>
         <w:tc>
           <w:tcPr>
             <w:tcW w:type="dxa" w:w="850"/>
@@ -4942,6 +5017,9 @@
         </w:tc>
       </w:tr>
       <w:tr>
+        <w:trPr>
+          <w:cantSplit/>
+        </w:trPr>
         <w:tc>
           <w:tcPr>
             <w:tcW w:type="dxa" w:w="850"/>
@@ -5021,6 +5099,9 @@
         </w:tc>
       </w:tr>
       <w:tr>
+        <w:trPr>
+          <w:cantSplit/>
+        </w:trPr>
         <w:tc>
           <w:tcPr>
             <w:tcW w:type="dxa" w:w="850"/>
@@ -5100,6 +5181,9 @@
         </w:tc>
       </w:tr>
       <w:tr>
+        <w:trPr>
+          <w:cantSplit/>
+        </w:trPr>
         <w:tc>
           <w:tcPr>
             <w:tcW w:type="dxa" w:w="850"/>
@@ -5179,6 +5263,9 @@
         </w:tc>
       </w:tr>
       <w:tr>
+        <w:trPr>
+          <w:cantSplit/>
+        </w:trPr>
         <w:tc>
           <w:tcPr>
             <w:tcW w:type="dxa" w:w="850"/>
@@ -5258,6 +5345,9 @@
         </w:tc>
       </w:tr>
       <w:tr>
+        <w:trPr>
+          <w:cantSplit/>
+        </w:trPr>
         <w:tc>
           <w:tcPr>
             <w:tcW w:type="dxa" w:w="850"/>

</xml_diff>